<commit_message>
COmplete Lab sheet 02
</commit_message>
<xml_diff>
--- a/02.LB02/LB02.docx
+++ b/02.LB02/LB02.docx
@@ -1905,6 +1905,46 @@
         </w:rPr>
         <w:t xml:space="preserve"> </w:t>
       </w:r>
+      <w:r>
+        <w:rPr>
+          <w:noProof/>
+        </w:rPr>
+        <w:drawing>
+          <wp:inline distT="0" distB="0" distL="0" distR="0" wp14:anchorId="02C6D2D0" wp14:editId="14F80B65">
+            <wp:extent cx="5943600" cy="3133090"/>
+            <wp:effectExtent l="0" t="0" r="0" b="0"/>
+            <wp:docPr id="5" name="Picture 5"/>
+            <wp:cNvGraphicFramePr>
+              <a:graphicFrameLocks xmlns:a="http://schemas.openxmlformats.org/drawingml/2006/main" noChangeAspect="1"/>
+            </wp:cNvGraphicFramePr>
+            <a:graphic xmlns:a="http://schemas.openxmlformats.org/drawingml/2006/main">
+              <a:graphicData uri="http://schemas.openxmlformats.org/drawingml/2006/picture">
+                <pic:pic xmlns:pic="http://schemas.openxmlformats.org/drawingml/2006/picture">
+                  <pic:nvPicPr>
+                    <pic:cNvPr id="1" name=""/>
+                    <pic:cNvPicPr/>
+                  </pic:nvPicPr>
+                  <pic:blipFill>
+                    <a:blip r:embed="rId9"/>
+                    <a:stretch>
+                      <a:fillRect/>
+                    </a:stretch>
+                  </pic:blipFill>
+                  <pic:spPr>
+                    <a:xfrm>
+                      <a:off x="0" y="0"/>
+                      <a:ext cx="5943600" cy="3133090"/>
+                    </a:xfrm>
+                    <a:prstGeom prst="rect">
+                      <a:avLst/>
+                    </a:prstGeom>
+                  </pic:spPr>
+                </pic:pic>
+              </a:graphicData>
+            </a:graphic>
+          </wp:inline>
+        </w:drawing>
+      </w:r>
     </w:p>
     <w:p>
       <w:pPr>
@@ -1914,15 +1954,47 @@
           <w:rFonts w:ascii="Times New Roman" w:hAnsi="Times New Roman" w:cs="Times New Roman"/>
         </w:rPr>
       </w:pPr>
-    </w:p>
-    <w:p>
-      <w:pPr>
-        <w:spacing w:after="180" w:line="256" w:lineRule="auto"/>
-        <w:jc w:val="both"/>
-        <w:rPr>
-          <w:rFonts w:ascii="Times New Roman" w:hAnsi="Times New Roman" w:cs="Times New Roman"/>
-        </w:rPr>
-      </w:pPr>
+      <w:r>
+        <w:rPr>
+          <w:noProof/>
+        </w:rPr>
+        <w:lastRenderedPageBreak/>
+        <w:drawing>
+          <wp:inline distT="0" distB="0" distL="0" distR="0" wp14:anchorId="28503358" wp14:editId="277D51B0">
+            <wp:extent cx="5943600" cy="4094480"/>
+            <wp:effectExtent l="0" t="0" r="0" b="1270"/>
+            <wp:docPr id="6" name="Picture 6"/>
+            <wp:cNvGraphicFramePr>
+              <a:graphicFrameLocks xmlns:a="http://schemas.openxmlformats.org/drawingml/2006/main" noChangeAspect="1"/>
+            </wp:cNvGraphicFramePr>
+            <a:graphic xmlns:a="http://schemas.openxmlformats.org/drawingml/2006/main">
+              <a:graphicData uri="http://schemas.openxmlformats.org/drawingml/2006/picture">
+                <pic:pic xmlns:pic="http://schemas.openxmlformats.org/drawingml/2006/picture">
+                  <pic:nvPicPr>
+                    <pic:cNvPr id="1" name=""/>
+                    <pic:cNvPicPr/>
+                  </pic:nvPicPr>
+                  <pic:blipFill>
+                    <a:blip r:embed="rId10"/>
+                    <a:stretch>
+                      <a:fillRect/>
+                    </a:stretch>
+                  </pic:blipFill>
+                  <pic:spPr>
+                    <a:xfrm>
+                      <a:off x="0" y="0"/>
+                      <a:ext cx="5943600" cy="4094480"/>
+                    </a:xfrm>
+                    <a:prstGeom prst="rect">
+                      <a:avLst/>
+                    </a:prstGeom>
+                  </pic:spPr>
+                </pic:pic>
+              </a:graphicData>
+            </a:graphic>
+          </wp:inline>
+        </w:drawing>
+      </w:r>
     </w:p>
     <w:p>
       <w:pPr>
@@ -2117,7 +2189,6 @@
           <w:rFonts w:ascii="Times New Roman" w:hAnsi="Times New Roman" w:cs="Times New Roman"/>
           <w:b/>
         </w:rPr>
-        <w:lastRenderedPageBreak/>
         <w:t>Make Reservation</w:t>
       </w:r>
       <w:r>
@@ -2248,6 +2319,7 @@
           <w:rFonts w:ascii="Times New Roman" w:hAnsi="Times New Roman" w:cs="Times New Roman"/>
           <w:b/>
         </w:rPr>
+        <w:lastRenderedPageBreak/>
         <w:t>Manage Bookings</w:t>
       </w:r>
       <w:r>
@@ -2343,6 +2415,113 @@
           <w:rFonts w:ascii="Times New Roman" w:hAnsi="Times New Roman" w:cs="Times New Roman"/>
         </w:rPr>
       </w:pPr>
+    </w:p>
+    <w:p>
+      <w:pPr>
+        <w:spacing w:after="180" w:line="256" w:lineRule="auto"/>
+        <w:jc w:val="both"/>
+        <w:rPr>
+          <w:rFonts w:ascii="Times New Roman" w:hAnsi="Times New Roman" w:cs="Times New Roman"/>
+        </w:rPr>
+      </w:pPr>
+      <w:r>
+        <w:rPr>
+          <w:noProof/>
+        </w:rPr>
+        <w:drawing>
+          <wp:inline distT="0" distB="0" distL="0" distR="0" wp14:anchorId="76D1FCDB" wp14:editId="25C68A63">
+            <wp:extent cx="5524500" cy="2843111"/>
+            <wp:effectExtent l="0" t="0" r="0" b="0"/>
+            <wp:docPr id="7" name="Picture 7"/>
+            <wp:cNvGraphicFramePr>
+              <a:graphicFrameLocks xmlns:a="http://schemas.openxmlformats.org/drawingml/2006/main" noChangeAspect="1"/>
+            </wp:cNvGraphicFramePr>
+            <a:graphic xmlns:a="http://schemas.openxmlformats.org/drawingml/2006/main">
+              <a:graphicData uri="http://schemas.openxmlformats.org/drawingml/2006/picture">
+                <pic:pic xmlns:pic="http://schemas.openxmlformats.org/drawingml/2006/picture">
+                  <pic:nvPicPr>
+                    <pic:cNvPr id="1" name=""/>
+                    <pic:cNvPicPr/>
+                  </pic:nvPicPr>
+                  <pic:blipFill>
+                    <a:blip r:embed="rId11"/>
+                    <a:stretch>
+                      <a:fillRect/>
+                    </a:stretch>
+                  </pic:blipFill>
+                  <pic:spPr>
+                    <a:xfrm>
+                      <a:off x="0" y="0"/>
+                      <a:ext cx="5529216" cy="2845538"/>
+                    </a:xfrm>
+                    <a:prstGeom prst="rect">
+                      <a:avLst/>
+                    </a:prstGeom>
+                  </pic:spPr>
+                </pic:pic>
+              </a:graphicData>
+            </a:graphic>
+          </wp:inline>
+        </w:drawing>
+      </w:r>
+    </w:p>
+    <w:p>
+      <w:pPr>
+        <w:spacing w:after="180" w:line="256" w:lineRule="auto"/>
+        <w:jc w:val="both"/>
+        <w:rPr>
+          <w:rFonts w:ascii="Times New Roman" w:hAnsi="Times New Roman" w:cs="Times New Roman"/>
+        </w:rPr>
+      </w:pPr>
+    </w:p>
+    <w:p>
+      <w:pPr>
+        <w:spacing w:after="180" w:line="256" w:lineRule="auto"/>
+        <w:jc w:val="both"/>
+        <w:rPr>
+          <w:rFonts w:ascii="Times New Roman" w:hAnsi="Times New Roman" w:cs="Times New Roman"/>
+        </w:rPr>
+      </w:pPr>
+      <w:r>
+        <w:rPr>
+          <w:noProof/>
+        </w:rPr>
+        <w:drawing>
+          <wp:inline distT="0" distB="0" distL="0" distR="0" wp14:anchorId="0110C85A" wp14:editId="1AA11688">
+            <wp:extent cx="5943600" cy="3385820"/>
+            <wp:effectExtent l="0" t="0" r="0" b="5080"/>
+            <wp:docPr id="8" name="Picture 8"/>
+            <wp:cNvGraphicFramePr>
+              <a:graphicFrameLocks xmlns:a="http://schemas.openxmlformats.org/drawingml/2006/main" noChangeAspect="1"/>
+            </wp:cNvGraphicFramePr>
+            <a:graphic xmlns:a="http://schemas.openxmlformats.org/drawingml/2006/main">
+              <a:graphicData uri="http://schemas.openxmlformats.org/drawingml/2006/picture">
+                <pic:pic xmlns:pic="http://schemas.openxmlformats.org/drawingml/2006/picture">
+                  <pic:nvPicPr>
+                    <pic:cNvPr id="1" name=""/>
+                    <pic:cNvPicPr/>
+                  </pic:nvPicPr>
+                  <pic:blipFill>
+                    <a:blip r:embed="rId12"/>
+                    <a:stretch>
+                      <a:fillRect/>
+                    </a:stretch>
+                  </pic:blipFill>
+                  <pic:spPr>
+                    <a:xfrm>
+                      <a:off x="0" y="0"/>
+                      <a:ext cx="5943600" cy="3385820"/>
+                    </a:xfrm>
+                    <a:prstGeom prst="rect">
+                      <a:avLst/>
+                    </a:prstGeom>
+                  </pic:spPr>
+                </pic:pic>
+              </a:graphicData>
+            </a:graphic>
+          </wp:inline>
+        </w:drawing>
+      </w:r>
       <w:r>
         <w:rPr>
           <w:rFonts w:ascii="Times New Roman" w:hAnsi="Times New Roman" w:cs="Times New Roman"/>
@@ -2362,6 +2541,7 @@
         <w:rPr>
           <w:rFonts w:ascii="Times New Roman" w:hAnsi="Times New Roman" w:cs="Times New Roman"/>
         </w:rPr>
+        <w:lastRenderedPageBreak/>
         <w:t xml:space="preserve">03) Car Rental System </w:t>
       </w:r>
     </w:p>
@@ -2828,6 +3008,46 @@
         </w:rPr>
         <w:t xml:space="preserve"> </w:t>
       </w:r>
+      <w:r>
+        <w:rPr>
+          <w:noProof/>
+        </w:rPr>
+        <w:drawing>
+          <wp:inline distT="0" distB="0" distL="0" distR="0" wp14:anchorId="1D887F41" wp14:editId="63B8603B">
+            <wp:extent cx="5218771" cy="2811780"/>
+            <wp:effectExtent l="0" t="0" r="1270" b="7620"/>
+            <wp:docPr id="9" name="Picture 9"/>
+            <wp:cNvGraphicFramePr>
+              <a:graphicFrameLocks xmlns:a="http://schemas.openxmlformats.org/drawingml/2006/main" noChangeAspect="1"/>
+            </wp:cNvGraphicFramePr>
+            <a:graphic xmlns:a="http://schemas.openxmlformats.org/drawingml/2006/main">
+              <a:graphicData uri="http://schemas.openxmlformats.org/drawingml/2006/picture">
+                <pic:pic xmlns:pic="http://schemas.openxmlformats.org/drawingml/2006/picture">
+                  <pic:nvPicPr>
+                    <pic:cNvPr id="1" name=""/>
+                    <pic:cNvPicPr/>
+                  </pic:nvPicPr>
+                  <pic:blipFill>
+                    <a:blip r:embed="rId13"/>
+                    <a:stretch>
+                      <a:fillRect/>
+                    </a:stretch>
+                  </pic:blipFill>
+                  <pic:spPr>
+                    <a:xfrm>
+                      <a:off x="0" y="0"/>
+                      <a:ext cx="5219749" cy="2812307"/>
+                    </a:xfrm>
+                    <a:prstGeom prst="rect">
+                      <a:avLst/>
+                    </a:prstGeom>
+                  </pic:spPr>
+                </pic:pic>
+              </a:graphicData>
+            </a:graphic>
+          </wp:inline>
+        </w:drawing>
+      </w:r>
     </w:p>
     <w:p>
       <w:pPr>
@@ -2851,6 +3071,55 @@
           <w:rFonts w:ascii="Times New Roman" w:hAnsi="Times New Roman" w:cs="Times New Roman"/>
         </w:rPr>
       </w:pPr>
+    </w:p>
+    <w:p>
+      <w:pPr>
+        <w:jc w:val="both"/>
+        <w:rPr>
+          <w:rFonts w:ascii="Times New Roman" w:hAnsi="Times New Roman" w:cs="Times New Roman"/>
+        </w:rPr>
+      </w:pPr>
+      <w:r>
+        <w:rPr>
+          <w:noProof/>
+        </w:rPr>
+        <w:lastRenderedPageBreak/>
+        <w:drawing>
+          <wp:inline distT="0" distB="0" distL="0" distR="0" wp14:anchorId="378453C4" wp14:editId="3067970E">
+            <wp:extent cx="5943600" cy="3051810"/>
+            <wp:effectExtent l="0" t="0" r="0" b="0"/>
+            <wp:docPr id="10" name="Picture 10"/>
+            <wp:cNvGraphicFramePr>
+              <a:graphicFrameLocks xmlns:a="http://schemas.openxmlformats.org/drawingml/2006/main" noChangeAspect="1"/>
+            </wp:cNvGraphicFramePr>
+            <a:graphic xmlns:a="http://schemas.openxmlformats.org/drawingml/2006/main">
+              <a:graphicData uri="http://schemas.openxmlformats.org/drawingml/2006/picture">
+                <pic:pic xmlns:pic="http://schemas.openxmlformats.org/drawingml/2006/picture">
+                  <pic:nvPicPr>
+                    <pic:cNvPr id="1" name=""/>
+                    <pic:cNvPicPr/>
+                  </pic:nvPicPr>
+                  <pic:blipFill>
+                    <a:blip r:embed="rId14"/>
+                    <a:stretch>
+                      <a:fillRect/>
+                    </a:stretch>
+                  </pic:blipFill>
+                  <pic:spPr>
+                    <a:xfrm>
+                      <a:off x="0" y="0"/>
+                      <a:ext cx="5943600" cy="3051810"/>
+                    </a:xfrm>
+                    <a:prstGeom prst="rect">
+                      <a:avLst/>
+                    </a:prstGeom>
+                  </pic:spPr>
+                </pic:pic>
+              </a:graphicData>
+            </a:graphic>
+          </wp:inline>
+        </w:drawing>
+      </w:r>
     </w:p>
     <w:sectPr>
       <w:pgSz w:w="12240" w:h="15840"/>

</xml_diff>